<commit_message>
feat(signing): integrate signature tags into fill pipeline
Phase 2 of agreement-signing integration:

- Add {sig_party_1}, {sig_party_2}, {date_party_1}, {date_party_2} tags
  to bonterms-mutual-nda template.docx signature blocks
- Create signing.yaml with signer roles and provider anchor mappings
  for DocuSign, Dropbox Sign, Adobe Sign, and PandaDoc
- Fill pipeline reads signing.yaml and injects empty defaults for
  signature tags when no provider is connected (prevents docx-templates
  ReferenceError on undefined tags)
- Engine excludes signing tag fields from "unknown field" warnings
- Core signing-config.ts module (no cross-package dependency)
- 307 test files, 2714 tests pass — zero regressions

Covers OA-SIG-004, OA-SIG-005, OA-SIG-006 scenarios.

Signed-off-by: Steven Obiajulu <steven@usejunior.com>
</commit_message>
<xml_diff>
--- a/content/templates/bonterms-mutual-nda/template.docx
+++ b/content/templates/bonterms-mutual-nda/template.docx
@@ -1067,7 +1067,7 @@
                 <w:sz w:val="18"/>
                 <w:szCs w:val="18"/>
               </w:rPr>
-              <w:t xml:space="preserve">Signature: </w:t>
+              <w:t xml:space="preserve">Signature: {sig_party_1}</w:t>
             </w:r>
           </w:p>
           <w:p>
@@ -1286,7 +1286,7 @@
                 <w:sz w:val="18"/>
                 <w:szCs w:val="18"/>
               </w:rPr>
-              <w:t>Date:</w:t>
+              <w:t>Date: {date_party_1}</w:t>
             </w:r>
             <w:r>
               <w:rPr>
@@ -1367,7 +1367,7 @@
                 <w:sz w:val="18"/>
                 <w:szCs w:val="18"/>
               </w:rPr>
-              <w:t xml:space="preserve">Signature: </w:t>
+              <w:t xml:space="preserve">Signature: {sig_party_2}</w:t>
             </w:r>
           </w:p>
           <w:p>
@@ -1576,7 +1576,7 @@
                 <w:sz w:val="18"/>
                 <w:szCs w:val="18"/>
               </w:rPr>
-              <w:t>Date:</w:t>
+              <w:t>Date: {date_party_2}</w:t>
             </w:r>
             <w:r>
               <w:rPr>

</xml_diff>

<commit_message>
feat(template): improve Bonterms NDA form quality for signing demo
Template DOCX:
- Fix gray text: remove themeColor/themeShade from tag placeholder runs
- Add 12 signatory fields: name, title, company, email, address per party
- Add computed checkbox glyphs (☑/☐) for notice email/postal
- Make signing anchors invisible: 2pt white text in separate runs
- Split sig/date anchor tags into dedicated runs for DocuSign placement

Metadata:
- Add party_1/2_signatory_type, name, title, company, email, address
- Add computed display fields: name_and_title, notice checks

Engine:
- Default signatory_company to party_name when not provided
- Compute signatory_name_and_title display ("Name, Title")
- Compute notice checkbox glyphs from email/address presence

Signing config:
- Update nameField to party_1_signatory_name (person, not entity)
</commit_message>
<xml_diff>
--- a/content/templates/bonterms-mutual-nda/template.docx
+++ b/content/templates/bonterms-mutual-nda/template.docx
@@ -59,7 +59,7 @@
               <w:rPr>
                 <w:rFonts w:asciiTheme="majorHAnsi" w:eastAsia="Calibri" w:hAnsiTheme="majorHAnsi" w:cstheme="majorHAnsi"/>
                 <w:b/>
-                <w:color w:val="FFFFFF" w:themeColor="background1"/>
+                <w:color w:val="FFFFFF"/>
                 <w:sz w:val="22"/>
                 <w:szCs w:val="22"/>
               </w:rPr>
@@ -69,7 +69,7 @@
               <w:rPr>
                 <w:rFonts w:asciiTheme="majorHAnsi" w:eastAsia="Calibri" w:hAnsiTheme="majorHAnsi" w:cstheme="majorHAnsi"/>
                 <w:b/>
-                <w:color w:val="FFFFFF" w:themeColor="background1"/>
+                <w:color w:val="FFFFFF"/>
                 <w:sz w:val="22"/>
                 <w:szCs w:val="22"/>
               </w:rPr>
@@ -79,7 +79,7 @@
               <w:rPr>
                 <w:rFonts w:asciiTheme="majorHAnsi" w:eastAsia="Calibri" w:hAnsiTheme="majorHAnsi" w:cstheme="majorHAnsi"/>
                 <w:b/>
-                <w:color w:val="FFFFFF" w:themeColor="background1"/>
+                <w:color w:val="FFFFFF"/>
                 <w:sz w:val="22"/>
                 <w:szCs w:val="22"/>
               </w:rPr>
@@ -89,7 +89,7 @@
               <w:rPr>
                 <w:rFonts w:asciiTheme="majorHAnsi" w:eastAsia="Calibri" w:hAnsiTheme="majorHAnsi" w:cstheme="majorHAnsi"/>
                 <w:b/>
-                <w:color w:val="FFFFFF" w:themeColor="background1"/>
+                <w:color w:val="FFFFFF"/>
                 <w:sz w:val="22"/>
                 <w:szCs w:val="22"/>
               </w:rPr>
@@ -99,7 +99,7 @@
               <w:rPr>
                 <w:rFonts w:asciiTheme="majorHAnsi" w:eastAsia="Calibri" w:hAnsiTheme="majorHAnsi" w:cstheme="majorHAnsi"/>
                 <w:b/>
-                <w:color w:val="FFFFFF" w:themeColor="background1"/>
+                <w:color w:val="FFFFFF"/>
                 <w:sz w:val="22"/>
                 <w:szCs w:val="22"/>
               </w:rPr>
@@ -109,7 +109,7 @@
               <w:rPr>
                 <w:rFonts w:asciiTheme="majorHAnsi" w:eastAsia="Calibri" w:hAnsiTheme="majorHAnsi" w:cstheme="majorHAnsi"/>
                 <w:b/>
-                <w:color w:val="FFFFFF" w:themeColor="background1"/>
+                <w:color w:val="FFFFFF"/>
                 <w:sz w:val="22"/>
                 <w:szCs w:val="22"/>
               </w:rPr>
@@ -338,7 +338,7 @@
               <w:rPr>
                 <w:rFonts w:asciiTheme="majorHAnsi" w:hAnsiTheme="majorHAnsi" w:cstheme="majorHAnsi"/>
                 <w:b/>
-                <w:color w:val="FFFFFF" w:themeColor="background1"/>
+                <w:color w:val="FFFFFF"/>
                 <w:szCs w:val="18"/>
               </w:rPr>
             </w:pPr>
@@ -346,7 +346,7 @@
               <w:rPr>
                 <w:rFonts w:asciiTheme="majorHAnsi" w:eastAsia="Calibri" w:hAnsiTheme="majorHAnsi" w:cstheme="majorHAnsi"/>
                 <w:b/>
-                <w:color w:val="FFFFFF" w:themeColor="background1"/>
+                <w:color w:val="FFFFFF"/>
                 <w:szCs w:val="18"/>
               </w:rPr>
               <w:t>Key Terms</w:t>
@@ -399,7 +399,7 @@
               <w:rPr>
                 <w:rFonts w:asciiTheme="majorHAnsi" w:hAnsiTheme="majorHAnsi" w:cstheme="majorHAnsi"/>
                 <w:b/>
-                <w:color w:val="808080" w:themeColor="background1" w:themeShade="80"/>
+                <w:color w:val="808080"/>
                 <w:sz w:val="20"/>
               </w:rPr>
             </w:pPr>
@@ -408,7 +408,7 @@
                 <w:rFonts w:asciiTheme="majorHAnsi" w:eastAsia="Calibri" w:hAnsiTheme="majorHAnsi" w:cstheme="majorHAnsi"/>
                 <w:b/>
                 <w:i/>
-                <w:color w:val="000000" w:themeColor="background1" w:themeShade="80"/>
+                <w:color w:val="000000"/>
                 <w:sz w:val="20"/>
               </w:rPr>
               <w:t>{purpose}</w:t>
@@ -461,7 +461,7 @@
               <w:rPr>
                 <w:rFonts w:asciiTheme="majorHAnsi" w:hAnsiTheme="majorHAnsi" w:cstheme="majorHAnsi"/>
                 <w:b/>
-                <w:color w:val="808080" w:themeColor="background1" w:themeShade="80"/>
+                <w:color w:val="808080"/>
                 <w:sz w:val="20"/>
               </w:rPr>
             </w:pPr>
@@ -470,7 +470,7 @@
                 <w:rFonts w:asciiTheme="majorHAnsi" w:eastAsia="Calibri" w:hAnsiTheme="majorHAnsi" w:cstheme="majorHAnsi"/>
                 <w:b/>
                 <w:i/>
-                <w:color w:val="000000" w:themeColor="background1" w:themeShade="80"/>
+                <w:color w:val="000000"/>
                 <w:sz w:val="20"/>
               </w:rPr>
               <w:t>{effective_date}</w:t>
@@ -528,7 +528,7 @@
                 <w:rFonts w:asciiTheme="majorHAnsi" w:eastAsia="Calibri" w:hAnsiTheme="majorHAnsi" w:cstheme="majorHAnsi"/>
                 <w:b/>
                 <w:i/>
-                <w:color w:val="000000" w:themeColor="background1" w:themeShade="80"/>
+                <w:color w:val="000000"/>
               </w:rPr>
               <w:t>{nda_term}</w:t>
             </w:r>
@@ -537,7 +537,7 @@
                 <w:rFonts w:asciiTheme="majorHAnsi" w:eastAsia="Calibri" w:hAnsiTheme="majorHAnsi" w:cstheme="majorHAnsi"/>
                 <w:b/>
                 <w:i/>
-                <w:color w:val="808080" w:themeColor="background1" w:themeShade="80"/>
+                <w:color w:val="808080"/>
               </w:rPr>
               <w:t xml:space="preserve"> </w:t>
             </w:r>
@@ -603,7 +603,7 @@
                 <w:rFonts w:asciiTheme="majorHAnsi" w:eastAsia="Calibri" w:hAnsiTheme="majorHAnsi" w:cstheme="majorHAnsi"/>
                 <w:b/>
                 <w:i/>
-                <w:color w:val="000000" w:themeColor="background1" w:themeShade="80"/>
+                <w:color w:val="000000"/>
               </w:rPr>
               <w:t>{confidentiality_period}</w:t>
             </w:r>
@@ -661,7 +661,7 @@
                 <w:rFonts w:asciiTheme="majorHAnsi" w:eastAsia="Calibri" w:hAnsiTheme="majorHAnsi" w:cstheme="majorHAnsi"/>
                 <w:b/>
                 <w:i/>
-                <w:color w:val="000000" w:themeColor="background1" w:themeShade="80"/>
+                <w:color w:val="000000"/>
               </w:rPr>
               <w:t>{governing_law}</w:t>
             </w:r>
@@ -718,7 +718,7 @@
                 <w:rFonts w:asciiTheme="majorHAnsi" w:eastAsia="Calibri" w:hAnsiTheme="majorHAnsi" w:cstheme="majorHAnsi"/>
                 <w:b/>
                 <w:i/>
-                <w:color w:val="000000" w:themeColor="background1" w:themeShade="80"/>
+                <w:color w:val="000000"/>
               </w:rPr>
               <w:t>{courts}</w:t>
             </w:r>
@@ -777,7 +777,7 @@
               <w:rPr>
                 <w:rFonts w:asciiTheme="majorHAnsi" w:hAnsiTheme="majorHAnsi" w:cstheme="majorHAnsi"/>
                 <w:b/>
-                <w:color w:val="FFFFFF" w:themeColor="background1"/>
+                <w:color w:val="FFFFFF"/>
                 <w:szCs w:val="18"/>
               </w:rPr>
             </w:pPr>
@@ -785,7 +785,7 @@
               <w:rPr>
                 <w:rFonts w:asciiTheme="majorHAnsi" w:eastAsia="Calibri" w:hAnsiTheme="majorHAnsi" w:cstheme="majorHAnsi"/>
                 <w:b/>
-                <w:color w:val="FFFFFF" w:themeColor="background1"/>
+                <w:color w:val="FFFFFF"/>
                 <w:szCs w:val="18"/>
               </w:rPr>
               <w:t>Additional Terms</w:t>
@@ -934,7 +934,7 @@
               <w:rPr>
                 <w:rFonts w:asciiTheme="majorHAnsi" w:hAnsiTheme="majorHAnsi" w:cstheme="majorHAnsi"/>
                 <w:b/>
-                <w:color w:val="FFFFFF" w:themeColor="background1"/>
+                <w:color w:val="FFFFFF"/>
                 <w:szCs w:val="18"/>
               </w:rPr>
             </w:pPr>
@@ -942,7 +942,7 @@
               <w:rPr>
                 <w:rFonts w:asciiTheme="majorHAnsi" w:eastAsia="Calibri" w:hAnsiTheme="majorHAnsi" w:cstheme="majorHAnsi"/>
                 <w:b/>
-                <w:color w:val="FFFFFF" w:themeColor="background1"/>
+                <w:color w:val="FFFFFF"/>
                 <w:szCs w:val="18"/>
               </w:rPr>
               <w:t>Signatures</w:t>
@@ -1067,7 +1067,15 @@
                 <w:sz w:val="18"/>
                 <w:szCs w:val="18"/>
               </w:rPr>
-              <w:t xml:space="preserve">Signature: {sig_party_1}</w:t>
+              <w:t xml:space="preserve">Signature: </w:t>
+            </w:r>
+            <w:r>
+              <w:rPr>
+                <w:sz w:val="4"/>
+                <w:szCs w:val="4"/>
+                <w:color w:val="FFFFFF"/>
+              </w:rPr>
+              <w:t>{sig_party_1}</w:t>
             </w:r>
           </w:p>
           <w:p>
@@ -1103,7 +1111,7 @@
                 <w:sz w:val="18"/>
                 <w:szCs w:val="18"/>
               </w:rPr>
-              <w:t>Name and Title:</w:t>
+              <w:t>Name and Title: {party_1_signatory_name_and_title}</w:t>
             </w:r>
           </w:p>
           <w:p>
@@ -1139,7 +1147,7 @@
                 <w:sz w:val="18"/>
                 <w:szCs w:val="18"/>
               </w:rPr>
-              <w:t xml:space="preserve">Company: </w:t>
+              <w:t xml:space="preserve">Company: {party_1_signatory_company}</w:t>
             </w:r>
           </w:p>
           <w:p>
@@ -1214,15 +1222,15 @@
                 <w:sz w:val="18"/>
                 <w:szCs w:val="18"/>
               </w:rPr>
-              <w:t>☐</w:t>
-            </w:r>
-            <w:r>
-              <w:rPr>
-                <w:rFonts w:asciiTheme="majorHAnsi" w:eastAsia="Calibri" w:hAnsiTheme="majorHAnsi" w:cstheme="majorHAnsi"/>
-                <w:sz w:val="18"/>
-                <w:szCs w:val="18"/>
-              </w:rPr>
-              <w:t xml:space="preserve"> Email:</w:t>
+              <w:t>{party_1_notice_email_check}</w:t>
+            </w:r>
+            <w:r>
+              <w:rPr>
+                <w:rFonts w:asciiTheme="majorHAnsi" w:eastAsia="Calibri" w:hAnsiTheme="majorHAnsi" w:cstheme="majorHAnsi"/>
+                <w:sz w:val="18"/>
+                <w:szCs w:val="18"/>
+              </w:rPr>
+              <w:t xml:space="preserve"> Email: {party_1_email}</w:t>
             </w:r>
           </w:p>
           <w:p>
@@ -1244,15 +1252,15 @@
                 <w:sz w:val="18"/>
                 <w:szCs w:val="18"/>
               </w:rPr>
-              <w:t>☐</w:t>
-            </w:r>
-            <w:r>
-              <w:rPr>
-                <w:rFonts w:asciiTheme="majorHAnsi" w:eastAsia="Calibri" w:hAnsiTheme="majorHAnsi" w:cstheme="majorHAnsi"/>
-                <w:sz w:val="18"/>
-                <w:szCs w:val="18"/>
-              </w:rPr>
-              <w:t xml:space="preserve"> Postal mail:</w:t>
+              <w:t>{party_1_notice_postal_check}</w:t>
+            </w:r>
+            <w:r>
+              <w:rPr>
+                <w:rFonts w:asciiTheme="majorHAnsi" w:eastAsia="Calibri" w:hAnsiTheme="majorHAnsi" w:cstheme="majorHAnsi"/>
+                <w:sz w:val="18"/>
+                <w:szCs w:val="18"/>
+              </w:rPr>
+              <w:t xml:space="preserve"> Postal mail: {party_1_address}</w:t>
             </w:r>
           </w:p>
           <w:p>
@@ -1286,7 +1294,15 @@
                 <w:sz w:val="18"/>
                 <w:szCs w:val="18"/>
               </w:rPr>
-              <w:t>Date: {date_party_1}</w:t>
+              <w:t>Date: </w:t>
+            </w:r>
+            <w:r>
+              <w:rPr>
+                <w:sz w:val="4"/>
+                <w:szCs w:val="4"/>
+                <w:color w:val="FFFFFF"/>
+              </w:rPr>
+              <w:t>{date_party_1}</w:t>
             </w:r>
             <w:r>
               <w:rPr>
@@ -1367,7 +1383,15 @@
                 <w:sz w:val="18"/>
                 <w:szCs w:val="18"/>
               </w:rPr>
-              <w:t xml:space="preserve">Signature: {sig_party_2}</w:t>
+              <w:t xml:space="preserve">Signature: </w:t>
+            </w:r>
+            <w:r>
+              <w:rPr>
+                <w:sz w:val="4"/>
+                <w:szCs w:val="4"/>
+                <w:color w:val="FFFFFF"/>
+              </w:rPr>
+              <w:t>{sig_party_2}</w:t>
             </w:r>
           </w:p>
           <w:p>
@@ -1401,7 +1425,7 @@
                 <w:sz w:val="18"/>
                 <w:szCs w:val="18"/>
               </w:rPr>
-              <w:t>Name and Title:</w:t>
+              <w:t>Name and Title: {party_2_signatory_name_and_title}</w:t>
             </w:r>
           </w:p>
           <w:p>
@@ -1435,7 +1459,7 @@
                 <w:sz w:val="18"/>
                 <w:szCs w:val="18"/>
               </w:rPr>
-              <w:t xml:space="preserve">Company: </w:t>
+              <w:t xml:space="preserve">Company: {party_2_signatory_company}</w:t>
             </w:r>
           </w:p>
           <w:p>
@@ -1507,15 +1531,15 @@
                 <w:sz w:val="18"/>
                 <w:szCs w:val="18"/>
               </w:rPr>
-              <w:t>☐</w:t>
-            </w:r>
-            <w:r>
-              <w:rPr>
-                <w:rFonts w:asciiTheme="majorHAnsi" w:eastAsia="Calibri" w:hAnsiTheme="majorHAnsi" w:cstheme="majorHAnsi"/>
-                <w:sz w:val="18"/>
-                <w:szCs w:val="18"/>
-              </w:rPr>
-              <w:t xml:space="preserve"> Email:</w:t>
+              <w:t>{party_2_notice_email_check}</w:t>
+            </w:r>
+            <w:r>
+              <w:rPr>
+                <w:rFonts w:asciiTheme="majorHAnsi" w:eastAsia="Calibri" w:hAnsiTheme="majorHAnsi" w:cstheme="majorHAnsi"/>
+                <w:sz w:val="18"/>
+                <w:szCs w:val="18"/>
+              </w:rPr>
+              <w:t xml:space="preserve"> Email: {party_2_email}</w:t>
             </w:r>
           </w:p>
           <w:p>
@@ -1536,15 +1560,15 @@
                 <w:sz w:val="18"/>
                 <w:szCs w:val="18"/>
               </w:rPr>
-              <w:t>☐</w:t>
-            </w:r>
-            <w:r>
-              <w:rPr>
-                <w:rFonts w:asciiTheme="majorHAnsi" w:eastAsia="Calibri" w:hAnsiTheme="majorHAnsi" w:cstheme="majorHAnsi"/>
-                <w:sz w:val="18"/>
-                <w:szCs w:val="18"/>
-              </w:rPr>
-              <w:t xml:space="preserve"> Postal mail:</w:t>
+              <w:t>{party_2_notice_postal_check}</w:t>
+            </w:r>
+            <w:r>
+              <w:rPr>
+                <w:rFonts w:asciiTheme="majorHAnsi" w:eastAsia="Calibri" w:hAnsiTheme="majorHAnsi" w:cstheme="majorHAnsi"/>
+                <w:sz w:val="18"/>
+                <w:szCs w:val="18"/>
+              </w:rPr>
+              <w:t xml:space="preserve"> Postal mail: {party_2_address}</w:t>
             </w:r>
           </w:p>
           <w:p>
@@ -1576,7 +1600,15 @@
                 <w:sz w:val="18"/>
                 <w:szCs w:val="18"/>
               </w:rPr>
-              <w:t>Date: {date_party_2}</w:t>
+              <w:t>Date: </w:t>
+            </w:r>
+            <w:r>
+              <w:rPr>
+                <w:sz w:val="4"/>
+                <w:szCs w:val="4"/>
+                <w:color w:val="FFFFFF"/>
+              </w:rPr>
+              <w:t>{date_party_2}</w:t>
             </w:r>
             <w:r>
               <w:rPr>

</xml_diff>

<commit_message>
feat(template): improve Bonterms NDA form quality for signing demo (#145)
Template DOCX:
- Fix gray text: remove themeColor/themeShade from tag placeholder runs
- Add 12 signatory fields: name, title, company, email, address per party
- Add computed checkbox glyphs (☑/☐) for notice email/postal
- Make signing anchors invisible: 2pt white text in separate runs
- Split sig/date anchor tags into dedicated runs for DocuSign placement

Metadata:
- Add party_1/2_signatory_type, name, title, company, email, address
- Add computed display fields: name_and_title, notice checks

Engine:
- Default signatory_company to party_name when not provided
- Compute signatory_name_and_title display ("Name, Title")
- Compute notice checkbox glyphs from email/address presence

Signing config:
- Update nameField to party_1_signatory_name (person, not entity)
</commit_message>
<xml_diff>
--- a/content/templates/bonterms-mutual-nda/template.docx
+++ b/content/templates/bonterms-mutual-nda/template.docx
@@ -59,7 +59,7 @@
               <w:rPr>
                 <w:rFonts w:asciiTheme="majorHAnsi" w:eastAsia="Calibri" w:hAnsiTheme="majorHAnsi" w:cstheme="majorHAnsi"/>
                 <w:b/>
-                <w:color w:val="FFFFFF" w:themeColor="background1"/>
+                <w:color w:val="FFFFFF"/>
                 <w:sz w:val="22"/>
                 <w:szCs w:val="22"/>
               </w:rPr>
@@ -69,7 +69,7 @@
               <w:rPr>
                 <w:rFonts w:asciiTheme="majorHAnsi" w:eastAsia="Calibri" w:hAnsiTheme="majorHAnsi" w:cstheme="majorHAnsi"/>
                 <w:b/>
-                <w:color w:val="FFFFFF" w:themeColor="background1"/>
+                <w:color w:val="FFFFFF"/>
                 <w:sz w:val="22"/>
                 <w:szCs w:val="22"/>
               </w:rPr>
@@ -79,7 +79,7 @@
               <w:rPr>
                 <w:rFonts w:asciiTheme="majorHAnsi" w:eastAsia="Calibri" w:hAnsiTheme="majorHAnsi" w:cstheme="majorHAnsi"/>
                 <w:b/>
-                <w:color w:val="FFFFFF" w:themeColor="background1"/>
+                <w:color w:val="FFFFFF"/>
                 <w:sz w:val="22"/>
                 <w:szCs w:val="22"/>
               </w:rPr>
@@ -89,7 +89,7 @@
               <w:rPr>
                 <w:rFonts w:asciiTheme="majorHAnsi" w:eastAsia="Calibri" w:hAnsiTheme="majorHAnsi" w:cstheme="majorHAnsi"/>
                 <w:b/>
-                <w:color w:val="FFFFFF" w:themeColor="background1"/>
+                <w:color w:val="FFFFFF"/>
                 <w:sz w:val="22"/>
                 <w:szCs w:val="22"/>
               </w:rPr>
@@ -99,7 +99,7 @@
               <w:rPr>
                 <w:rFonts w:asciiTheme="majorHAnsi" w:eastAsia="Calibri" w:hAnsiTheme="majorHAnsi" w:cstheme="majorHAnsi"/>
                 <w:b/>
-                <w:color w:val="FFFFFF" w:themeColor="background1"/>
+                <w:color w:val="FFFFFF"/>
                 <w:sz w:val="22"/>
                 <w:szCs w:val="22"/>
               </w:rPr>
@@ -109,7 +109,7 @@
               <w:rPr>
                 <w:rFonts w:asciiTheme="majorHAnsi" w:eastAsia="Calibri" w:hAnsiTheme="majorHAnsi" w:cstheme="majorHAnsi"/>
                 <w:b/>
-                <w:color w:val="FFFFFF" w:themeColor="background1"/>
+                <w:color w:val="FFFFFF"/>
                 <w:sz w:val="22"/>
                 <w:szCs w:val="22"/>
               </w:rPr>
@@ -338,7 +338,7 @@
               <w:rPr>
                 <w:rFonts w:asciiTheme="majorHAnsi" w:hAnsiTheme="majorHAnsi" w:cstheme="majorHAnsi"/>
                 <w:b/>
-                <w:color w:val="FFFFFF" w:themeColor="background1"/>
+                <w:color w:val="FFFFFF"/>
                 <w:szCs w:val="18"/>
               </w:rPr>
             </w:pPr>
@@ -346,7 +346,7 @@
               <w:rPr>
                 <w:rFonts w:asciiTheme="majorHAnsi" w:eastAsia="Calibri" w:hAnsiTheme="majorHAnsi" w:cstheme="majorHAnsi"/>
                 <w:b/>
-                <w:color w:val="FFFFFF" w:themeColor="background1"/>
+                <w:color w:val="FFFFFF"/>
                 <w:szCs w:val="18"/>
               </w:rPr>
               <w:t>Key Terms</w:t>
@@ -399,7 +399,7 @@
               <w:rPr>
                 <w:rFonts w:asciiTheme="majorHAnsi" w:hAnsiTheme="majorHAnsi" w:cstheme="majorHAnsi"/>
                 <w:b/>
-                <w:color w:val="808080" w:themeColor="background1" w:themeShade="80"/>
+                <w:color w:val="808080"/>
                 <w:sz w:val="20"/>
               </w:rPr>
             </w:pPr>
@@ -408,7 +408,7 @@
                 <w:rFonts w:asciiTheme="majorHAnsi" w:eastAsia="Calibri" w:hAnsiTheme="majorHAnsi" w:cstheme="majorHAnsi"/>
                 <w:b/>
                 <w:i/>
-                <w:color w:val="000000" w:themeColor="background1" w:themeShade="80"/>
+                <w:color w:val="000000"/>
                 <w:sz w:val="20"/>
               </w:rPr>
               <w:t>{purpose}</w:t>
@@ -461,7 +461,7 @@
               <w:rPr>
                 <w:rFonts w:asciiTheme="majorHAnsi" w:hAnsiTheme="majorHAnsi" w:cstheme="majorHAnsi"/>
                 <w:b/>
-                <w:color w:val="808080" w:themeColor="background1" w:themeShade="80"/>
+                <w:color w:val="808080"/>
                 <w:sz w:val="20"/>
               </w:rPr>
             </w:pPr>
@@ -470,7 +470,7 @@
                 <w:rFonts w:asciiTheme="majorHAnsi" w:eastAsia="Calibri" w:hAnsiTheme="majorHAnsi" w:cstheme="majorHAnsi"/>
                 <w:b/>
                 <w:i/>
-                <w:color w:val="000000" w:themeColor="background1" w:themeShade="80"/>
+                <w:color w:val="000000"/>
                 <w:sz w:val="20"/>
               </w:rPr>
               <w:t>{effective_date}</w:t>
@@ -528,7 +528,7 @@
                 <w:rFonts w:asciiTheme="majorHAnsi" w:eastAsia="Calibri" w:hAnsiTheme="majorHAnsi" w:cstheme="majorHAnsi"/>
                 <w:b/>
                 <w:i/>
-                <w:color w:val="000000" w:themeColor="background1" w:themeShade="80"/>
+                <w:color w:val="000000"/>
               </w:rPr>
               <w:t>{nda_term}</w:t>
             </w:r>
@@ -537,7 +537,7 @@
                 <w:rFonts w:asciiTheme="majorHAnsi" w:eastAsia="Calibri" w:hAnsiTheme="majorHAnsi" w:cstheme="majorHAnsi"/>
                 <w:b/>
                 <w:i/>
-                <w:color w:val="808080" w:themeColor="background1" w:themeShade="80"/>
+                <w:color w:val="808080"/>
               </w:rPr>
               <w:t xml:space="preserve"> </w:t>
             </w:r>
@@ -603,7 +603,7 @@
                 <w:rFonts w:asciiTheme="majorHAnsi" w:eastAsia="Calibri" w:hAnsiTheme="majorHAnsi" w:cstheme="majorHAnsi"/>
                 <w:b/>
                 <w:i/>
-                <w:color w:val="000000" w:themeColor="background1" w:themeShade="80"/>
+                <w:color w:val="000000"/>
               </w:rPr>
               <w:t>{confidentiality_period}</w:t>
             </w:r>
@@ -661,7 +661,7 @@
                 <w:rFonts w:asciiTheme="majorHAnsi" w:eastAsia="Calibri" w:hAnsiTheme="majorHAnsi" w:cstheme="majorHAnsi"/>
                 <w:b/>
                 <w:i/>
-                <w:color w:val="000000" w:themeColor="background1" w:themeShade="80"/>
+                <w:color w:val="000000"/>
               </w:rPr>
               <w:t>{governing_law}</w:t>
             </w:r>
@@ -718,7 +718,7 @@
                 <w:rFonts w:asciiTheme="majorHAnsi" w:eastAsia="Calibri" w:hAnsiTheme="majorHAnsi" w:cstheme="majorHAnsi"/>
                 <w:b/>
                 <w:i/>
-                <w:color w:val="000000" w:themeColor="background1" w:themeShade="80"/>
+                <w:color w:val="000000"/>
               </w:rPr>
               <w:t>{courts}</w:t>
             </w:r>
@@ -777,7 +777,7 @@
               <w:rPr>
                 <w:rFonts w:asciiTheme="majorHAnsi" w:hAnsiTheme="majorHAnsi" w:cstheme="majorHAnsi"/>
                 <w:b/>
-                <w:color w:val="FFFFFF" w:themeColor="background1"/>
+                <w:color w:val="FFFFFF"/>
                 <w:szCs w:val="18"/>
               </w:rPr>
             </w:pPr>
@@ -785,7 +785,7 @@
               <w:rPr>
                 <w:rFonts w:asciiTheme="majorHAnsi" w:eastAsia="Calibri" w:hAnsiTheme="majorHAnsi" w:cstheme="majorHAnsi"/>
                 <w:b/>
-                <w:color w:val="FFFFFF" w:themeColor="background1"/>
+                <w:color w:val="FFFFFF"/>
                 <w:szCs w:val="18"/>
               </w:rPr>
               <w:t>Additional Terms</w:t>
@@ -934,7 +934,7 @@
               <w:rPr>
                 <w:rFonts w:asciiTheme="majorHAnsi" w:hAnsiTheme="majorHAnsi" w:cstheme="majorHAnsi"/>
                 <w:b/>
-                <w:color w:val="FFFFFF" w:themeColor="background1"/>
+                <w:color w:val="FFFFFF"/>
                 <w:szCs w:val="18"/>
               </w:rPr>
             </w:pPr>
@@ -942,7 +942,7 @@
               <w:rPr>
                 <w:rFonts w:asciiTheme="majorHAnsi" w:eastAsia="Calibri" w:hAnsiTheme="majorHAnsi" w:cstheme="majorHAnsi"/>
                 <w:b/>
-                <w:color w:val="FFFFFF" w:themeColor="background1"/>
+                <w:color w:val="FFFFFF"/>
                 <w:szCs w:val="18"/>
               </w:rPr>
               <w:t>Signatures</w:t>
@@ -1067,7 +1067,15 @@
                 <w:sz w:val="18"/>
                 <w:szCs w:val="18"/>
               </w:rPr>
-              <w:t xml:space="preserve">Signature: {sig_party_1}</w:t>
+              <w:t xml:space="preserve">Signature: </w:t>
+            </w:r>
+            <w:r>
+              <w:rPr>
+                <w:sz w:val="4"/>
+                <w:szCs w:val="4"/>
+                <w:color w:val="FFFFFF"/>
+              </w:rPr>
+              <w:t>{sig_party_1}</w:t>
             </w:r>
           </w:p>
           <w:p>
@@ -1103,7 +1111,7 @@
                 <w:sz w:val="18"/>
                 <w:szCs w:val="18"/>
               </w:rPr>
-              <w:t>Name and Title:</w:t>
+              <w:t>Name and Title: {party_1_signatory_name_and_title}</w:t>
             </w:r>
           </w:p>
           <w:p>
@@ -1139,7 +1147,7 @@
                 <w:sz w:val="18"/>
                 <w:szCs w:val="18"/>
               </w:rPr>
-              <w:t xml:space="preserve">Company: </w:t>
+              <w:t xml:space="preserve">Company: {party_1_signatory_company}</w:t>
             </w:r>
           </w:p>
           <w:p>
@@ -1214,15 +1222,15 @@
                 <w:sz w:val="18"/>
                 <w:szCs w:val="18"/>
               </w:rPr>
-              <w:t>☐</w:t>
-            </w:r>
-            <w:r>
-              <w:rPr>
-                <w:rFonts w:asciiTheme="majorHAnsi" w:eastAsia="Calibri" w:hAnsiTheme="majorHAnsi" w:cstheme="majorHAnsi"/>
-                <w:sz w:val="18"/>
-                <w:szCs w:val="18"/>
-              </w:rPr>
-              <w:t xml:space="preserve"> Email:</w:t>
+              <w:t>{party_1_notice_email_check}</w:t>
+            </w:r>
+            <w:r>
+              <w:rPr>
+                <w:rFonts w:asciiTheme="majorHAnsi" w:eastAsia="Calibri" w:hAnsiTheme="majorHAnsi" w:cstheme="majorHAnsi"/>
+                <w:sz w:val="18"/>
+                <w:szCs w:val="18"/>
+              </w:rPr>
+              <w:t xml:space="preserve"> Email: {party_1_email}</w:t>
             </w:r>
           </w:p>
           <w:p>
@@ -1244,15 +1252,15 @@
                 <w:sz w:val="18"/>
                 <w:szCs w:val="18"/>
               </w:rPr>
-              <w:t>☐</w:t>
-            </w:r>
-            <w:r>
-              <w:rPr>
-                <w:rFonts w:asciiTheme="majorHAnsi" w:eastAsia="Calibri" w:hAnsiTheme="majorHAnsi" w:cstheme="majorHAnsi"/>
-                <w:sz w:val="18"/>
-                <w:szCs w:val="18"/>
-              </w:rPr>
-              <w:t xml:space="preserve"> Postal mail:</w:t>
+              <w:t>{party_1_notice_postal_check}</w:t>
+            </w:r>
+            <w:r>
+              <w:rPr>
+                <w:rFonts w:asciiTheme="majorHAnsi" w:eastAsia="Calibri" w:hAnsiTheme="majorHAnsi" w:cstheme="majorHAnsi"/>
+                <w:sz w:val="18"/>
+                <w:szCs w:val="18"/>
+              </w:rPr>
+              <w:t xml:space="preserve"> Postal mail: {party_1_address}</w:t>
             </w:r>
           </w:p>
           <w:p>
@@ -1286,7 +1294,15 @@
                 <w:sz w:val="18"/>
                 <w:szCs w:val="18"/>
               </w:rPr>
-              <w:t>Date: {date_party_1}</w:t>
+              <w:t>Date: </w:t>
+            </w:r>
+            <w:r>
+              <w:rPr>
+                <w:sz w:val="4"/>
+                <w:szCs w:val="4"/>
+                <w:color w:val="FFFFFF"/>
+              </w:rPr>
+              <w:t>{date_party_1}</w:t>
             </w:r>
             <w:r>
               <w:rPr>
@@ -1367,7 +1383,15 @@
                 <w:sz w:val="18"/>
                 <w:szCs w:val="18"/>
               </w:rPr>
-              <w:t xml:space="preserve">Signature: {sig_party_2}</w:t>
+              <w:t xml:space="preserve">Signature: </w:t>
+            </w:r>
+            <w:r>
+              <w:rPr>
+                <w:sz w:val="4"/>
+                <w:szCs w:val="4"/>
+                <w:color w:val="FFFFFF"/>
+              </w:rPr>
+              <w:t>{sig_party_2}</w:t>
             </w:r>
           </w:p>
           <w:p>
@@ -1401,7 +1425,7 @@
                 <w:sz w:val="18"/>
                 <w:szCs w:val="18"/>
               </w:rPr>
-              <w:t>Name and Title:</w:t>
+              <w:t>Name and Title: {party_2_signatory_name_and_title}</w:t>
             </w:r>
           </w:p>
           <w:p>
@@ -1435,7 +1459,7 @@
                 <w:sz w:val="18"/>
                 <w:szCs w:val="18"/>
               </w:rPr>
-              <w:t xml:space="preserve">Company: </w:t>
+              <w:t xml:space="preserve">Company: {party_2_signatory_company}</w:t>
             </w:r>
           </w:p>
           <w:p>
@@ -1507,15 +1531,15 @@
                 <w:sz w:val="18"/>
                 <w:szCs w:val="18"/>
               </w:rPr>
-              <w:t>☐</w:t>
-            </w:r>
-            <w:r>
-              <w:rPr>
-                <w:rFonts w:asciiTheme="majorHAnsi" w:eastAsia="Calibri" w:hAnsiTheme="majorHAnsi" w:cstheme="majorHAnsi"/>
-                <w:sz w:val="18"/>
-                <w:szCs w:val="18"/>
-              </w:rPr>
-              <w:t xml:space="preserve"> Email:</w:t>
+              <w:t>{party_2_notice_email_check}</w:t>
+            </w:r>
+            <w:r>
+              <w:rPr>
+                <w:rFonts w:asciiTheme="majorHAnsi" w:eastAsia="Calibri" w:hAnsiTheme="majorHAnsi" w:cstheme="majorHAnsi"/>
+                <w:sz w:val="18"/>
+                <w:szCs w:val="18"/>
+              </w:rPr>
+              <w:t xml:space="preserve"> Email: {party_2_email}</w:t>
             </w:r>
           </w:p>
           <w:p>
@@ -1536,15 +1560,15 @@
                 <w:sz w:val="18"/>
                 <w:szCs w:val="18"/>
               </w:rPr>
-              <w:t>☐</w:t>
-            </w:r>
-            <w:r>
-              <w:rPr>
-                <w:rFonts w:asciiTheme="majorHAnsi" w:eastAsia="Calibri" w:hAnsiTheme="majorHAnsi" w:cstheme="majorHAnsi"/>
-                <w:sz w:val="18"/>
-                <w:szCs w:val="18"/>
-              </w:rPr>
-              <w:t xml:space="preserve"> Postal mail:</w:t>
+              <w:t>{party_2_notice_postal_check}</w:t>
+            </w:r>
+            <w:r>
+              <w:rPr>
+                <w:rFonts w:asciiTheme="majorHAnsi" w:eastAsia="Calibri" w:hAnsiTheme="majorHAnsi" w:cstheme="majorHAnsi"/>
+                <w:sz w:val="18"/>
+                <w:szCs w:val="18"/>
+              </w:rPr>
+              <w:t xml:space="preserve"> Postal mail: {party_2_address}</w:t>
             </w:r>
           </w:p>
           <w:p>
@@ -1576,7 +1600,15 @@
                 <w:sz w:val="18"/>
                 <w:szCs w:val="18"/>
               </w:rPr>
-              <w:t>Date: {date_party_2}</w:t>
+              <w:t>Date: </w:t>
+            </w:r>
+            <w:r>
+              <w:rPr>
+                <w:sz w:val="4"/>
+                <w:szCs w:val="4"/>
+                <w:color w:val="FFFFFF"/>
+              </w:rPr>
+              <w:t>{date_party_2}</w:t>
             </w:r>
             <w:r>
               <w:rPr>

</xml_diff>